<commit_message>
update on 2026-01-03 18:53:27.569204
</commit_message>
<xml_diff>
--- a/py - system.docx
+++ b/py - system.docx
@@ -18,8 +18,8 @@
           </w14:textFill>
         </w:rPr>
       </w:pPr>
-      <w:bookmarkStart w:id="0" w:name="_Toc1708"/>
-      <w:bookmarkStart w:id="1" w:name="_Toc12288"/>
+      <w:bookmarkStart w:id="0" w:name="_Toc12288"/>
+      <w:bookmarkStart w:id="1" w:name="_Toc1708"/>
       <w:r>
         <w:rPr>
           <w:rFonts w:hint="eastAsia" w:cs="华文中宋"/>
@@ -263,7 +263,7 @@
                 <w:color w:val="FF0000"/>
                 <w:spacing w:val="7"/>
               </w:rPr>
-              <w:t xml:space="preserve">str, </w:t>
+              <w:t xml:space="preserve">str, type, default, </w:t>
             </w:r>
             <w:r>
               <w:rPr>
@@ -275,14 +275,16 @@
               </w:rPr>
               <w:t xml:space="preserve">required, </w:t>
             </w:r>
-            <w:r>
-              <w:rPr>
-                <w:rFonts w:hint="eastAsia" w:cs="华文中宋"/>
-                <w:bCs/>
-                <w:color w:val="FF0000"/>
-                <w:spacing w:val="7"/>
-              </w:rPr>
-              <w:t>type, default, help)</w:t>
+            <w:bookmarkStart w:id="27" w:name="_GoBack"/>
+            <w:bookmarkEnd w:id="27"/>
+            <w:r>
+              <w:rPr>
+                <w:rFonts w:hint="eastAsia" w:cs="华文中宋"/>
+                <w:bCs/>
+                <w:color w:val="FF0000"/>
+                <w:spacing w:val="7"/>
+              </w:rPr>
+              <w:t>help)</w:t>
             </w:r>
           </w:p>
         </w:tc>
@@ -718,8 +720,8 @@
           </w14:textFill>
         </w:rPr>
       </w:pPr>
-      <w:bookmarkStart w:id="2" w:name="_Toc22979"/>
-      <w:bookmarkStart w:id="3" w:name="_Toc30515"/>
+      <w:bookmarkStart w:id="2" w:name="_Toc30515"/>
+      <w:bookmarkStart w:id="3" w:name="_Toc22979"/>
       <w:r>
         <w:rPr>
           <w:rFonts w:hint="eastAsia" w:cs="华文中宋"/>
@@ -2738,6 +2740,12 @@
             <w:insideH w:val="single" w:color="auto" w:sz="4" w:space="0"/>
             <w:insideV w:val="single" w:color="auto" w:sz="4" w:space="0"/>
           </w:tblBorders>
+          <w:tblCellMar>
+            <w:top w:w="0" w:type="dxa"/>
+            <w:left w:w="108" w:type="dxa"/>
+            <w:bottom w:w="0" w:type="dxa"/>
+            <w:right w:w="108" w:type="dxa"/>
+          </w:tblCellMar>
         </w:tblPrEx>
         <w:tc>
           <w:tcPr>
@@ -8142,8 +8150,8 @@
           </w14:textFill>
         </w:rPr>
       </w:pPr>
-      <w:bookmarkStart w:id="6" w:name="_Toc27725"/>
-      <w:bookmarkStart w:id="7" w:name="_Toc31407"/>
+      <w:bookmarkStart w:id="6" w:name="_Toc31407"/>
+      <w:bookmarkStart w:id="7" w:name="_Toc27725"/>
       <w:r>
         <w:rPr>
           <w:rFonts w:hint="eastAsia" w:cs="华文中宋"/>
@@ -8588,6 +8596,12 @@
             <w:insideH w:val="single" w:color="auto" w:sz="4" w:space="0"/>
             <w:insideV w:val="single" w:color="auto" w:sz="4" w:space="0"/>
           </w:tblBorders>
+          <w:tblCellMar>
+            <w:top w:w="0" w:type="dxa"/>
+            <w:left w:w="108" w:type="dxa"/>
+            <w:bottom w:w="0" w:type="dxa"/>
+            <w:right w:w="108" w:type="dxa"/>
+          </w:tblCellMar>
         </w:tblPrEx>
         <w:tc>
           <w:tcPr>
@@ -10771,12 +10785,6 @@
             <w:insideH w:val="single" w:color="auto" w:sz="4" w:space="0"/>
             <w:insideV w:val="single" w:color="auto" w:sz="4" w:space="0"/>
           </w:tblBorders>
-          <w:tblCellMar>
-            <w:top w:w="0" w:type="dxa"/>
-            <w:left w:w="108" w:type="dxa"/>
-            <w:bottom w:w="0" w:type="dxa"/>
-            <w:right w:w="108" w:type="dxa"/>
-          </w:tblCellMar>
         </w:tblPrEx>
         <w:tc>
           <w:tcPr>
@@ -14291,6 +14299,12 @@
             <w:insideH w:val="single" w:color="auto" w:sz="4" w:space="0"/>
             <w:insideV w:val="single" w:color="auto" w:sz="4" w:space="0"/>
           </w:tblBorders>
+          <w:tblCellMar>
+            <w:top w:w="0" w:type="dxa"/>
+            <w:left w:w="108" w:type="dxa"/>
+            <w:bottom w:w="0" w:type="dxa"/>
+            <w:right w:w="108" w:type="dxa"/>
+          </w:tblCellMar>
         </w:tblPrEx>
         <w:tc>
           <w:tcPr>
@@ -16785,12 +16799,6 @@
             <w:insideH w:val="single" w:color="auto" w:sz="4" w:space="0"/>
             <w:insideV w:val="single" w:color="auto" w:sz="4" w:space="0"/>
           </w:tblBorders>
-          <w:tblCellMar>
-            <w:top w:w="0" w:type="dxa"/>
-            <w:left w:w="108" w:type="dxa"/>
-            <w:bottom w:w="0" w:type="dxa"/>
-            <w:right w:w="108" w:type="dxa"/>
-          </w:tblCellMar>
         </w:tblPrEx>
         <w:trPr>
           <w:trHeight w:val="290" w:hRule="atLeast"/>
@@ -23239,8 +23247,8 @@
           </w14:textFill>
         </w:rPr>
       </w:pPr>
-      <w:bookmarkStart w:id="13" w:name="_Toc10652"/>
-      <w:bookmarkStart w:id="14" w:name="_Toc23811"/>
+      <w:bookmarkStart w:id="13" w:name="_Toc23811"/>
+      <w:bookmarkStart w:id="14" w:name="_Toc10652"/>
       <w:r>
         <w:rPr>
           <w:rFonts w:hint="eastAsia" w:cs="华文中宋"/>
@@ -23293,12 +23301,6 @@
             <w:insideH w:val="single" w:color="auto" w:sz="4" w:space="0"/>
             <w:insideV w:val="single" w:color="auto" w:sz="4" w:space="0"/>
           </w:tblBorders>
-          <w:tblCellMar>
-            <w:top w:w="0" w:type="dxa"/>
-            <w:left w:w="108" w:type="dxa"/>
-            <w:bottom w:w="0" w:type="dxa"/>
-            <w:right w:w="108" w:type="dxa"/>
-          </w:tblCellMar>
         </w:tblPrEx>
         <w:tc>
           <w:tcPr>
@@ -25944,8 +25946,8 @@
         <w:outlineLvl w:val="0"/>
       </w:pPr>
       <w:bookmarkStart w:id="16" w:name="_Toc7235"/>
-      <w:bookmarkStart w:id="17" w:name="_Toc17683"/>
-      <w:bookmarkStart w:id="18" w:name="_Toc15387"/>
+      <w:bookmarkStart w:id="17" w:name="_Toc15387"/>
+      <w:bookmarkStart w:id="18" w:name="_Toc17683"/>
       <w:r>
         <w:rPr>
           <w:rFonts w:hint="eastAsia" w:cs="华文中宋"/>
@@ -25999,12 +26001,6 @@
             <w:insideH w:val="single" w:color="auto" w:sz="4" w:space="0"/>
             <w:insideV w:val="single" w:color="auto" w:sz="4" w:space="0"/>
           </w:tblBorders>
-          <w:tblCellMar>
-            <w:top w:w="0" w:type="dxa"/>
-            <w:left w:w="108" w:type="dxa"/>
-            <w:bottom w:w="0" w:type="dxa"/>
-            <w:right w:w="108" w:type="dxa"/>
-          </w:tblCellMar>
         </w:tblPrEx>
         <w:tc>
           <w:tcPr>
@@ -26115,12 +26111,6 @@
             <w:insideH w:val="single" w:color="auto" w:sz="4" w:space="0"/>
             <w:insideV w:val="single" w:color="auto" w:sz="4" w:space="0"/>
           </w:tblBorders>
-          <w:tblCellMar>
-            <w:top w:w="0" w:type="dxa"/>
-            <w:left w:w="108" w:type="dxa"/>
-            <w:bottom w:w="0" w:type="dxa"/>
-            <w:right w:w="108" w:type="dxa"/>
-          </w:tblCellMar>
         </w:tblPrEx>
         <w:tc>
           <w:tcPr>
@@ -33832,12 +33822,6 @@
             <w:insideH w:val="single" w:color="auto" w:sz="4" w:space="0"/>
             <w:insideV w:val="single" w:color="auto" w:sz="4" w:space="0"/>
           </w:tblBorders>
-          <w:tblCellMar>
-            <w:top w:w="0" w:type="dxa"/>
-            <w:left w:w="108" w:type="dxa"/>
-            <w:bottom w:w="0" w:type="dxa"/>
-            <w:right w:w="108" w:type="dxa"/>
-          </w:tblCellMar>
         </w:tblPrEx>
         <w:tc>
           <w:tcPr>
@@ -34979,12 +34963,6 @@
             <w:insideH w:val="single" w:color="auto" w:sz="4" w:space="0"/>
             <w:insideV w:val="single" w:color="auto" w:sz="4" w:space="0"/>
           </w:tblBorders>
-          <w:tblCellMar>
-            <w:top w:w="0" w:type="dxa"/>
-            <w:left w:w="108" w:type="dxa"/>
-            <w:bottom w:w="0" w:type="dxa"/>
-            <w:right w:w="108" w:type="dxa"/>
-          </w:tblCellMar>
         </w:tblPrEx>
         <w:tc>
           <w:tcPr>
@@ -39754,12 +39732,6 @@
             <w:insideH w:val="single" w:color="auto" w:sz="4" w:space="0"/>
             <w:insideV w:val="single" w:color="auto" w:sz="4" w:space="0"/>
           </w:tblBorders>
-          <w:tblCellMar>
-            <w:top w:w="0" w:type="dxa"/>
-            <w:left w:w="108" w:type="dxa"/>
-            <w:bottom w:w="0" w:type="dxa"/>
-            <w:right w:w="108" w:type="dxa"/>
-          </w:tblCellMar>
         </w:tblPrEx>
         <w:tc>
           <w:tcPr>
@@ -40333,12 +40305,6 @@
             <w:insideH w:val="single" w:color="auto" w:sz="4" w:space="0"/>
             <w:insideV w:val="single" w:color="auto" w:sz="4" w:space="0"/>
           </w:tblBorders>
-          <w:tblCellMar>
-            <w:top w:w="0" w:type="dxa"/>
-            <w:left w:w="108" w:type="dxa"/>
-            <w:bottom w:w="0" w:type="dxa"/>
-            <w:right w:w="108" w:type="dxa"/>
-          </w:tblCellMar>
         </w:tblPrEx>
         <w:tc>
           <w:tcPr>
@@ -40969,6 +40935,12 @@
             <w:insideH w:val="single" w:color="auto" w:sz="4" w:space="0"/>
             <w:insideV w:val="single" w:color="auto" w:sz="4" w:space="0"/>
           </w:tblBorders>
+          <w:tblCellMar>
+            <w:top w:w="0" w:type="dxa"/>
+            <w:left w:w="108" w:type="dxa"/>
+            <w:bottom w:w="0" w:type="dxa"/>
+            <w:right w:w="108" w:type="dxa"/>
+          </w:tblCellMar>
         </w:tblPrEx>
         <w:tc>
           <w:tcPr>
@@ -46853,8 +46825,8 @@
           </w14:textFill>
         </w:rPr>
       </w:pPr>
-      <w:bookmarkStart w:id="25" w:name="_Toc7657"/>
-      <w:bookmarkStart w:id="26" w:name="_Toc19183"/>
+      <w:bookmarkStart w:id="25" w:name="_Toc19183"/>
+      <w:bookmarkStart w:id="26" w:name="_Toc7657"/>
       <w:r>
         <w:rPr>
           <w:rFonts w:hint="eastAsia" w:cs="华文中宋"/>

</xml_diff>

<commit_message>
update on 2026-07-18 22:23:21.137040
</commit_message>
<xml_diff>
--- a/py - system.docx
+++ b/py - system.docx
@@ -18,8 +18,8 @@
           </w14:textFill>
         </w:rPr>
       </w:pPr>
-      <w:bookmarkStart w:id="0" w:name="_Toc1708"/>
-      <w:bookmarkStart w:id="1" w:name="_Toc12288"/>
+      <w:bookmarkStart w:id="0" w:name="_Toc12288"/>
+      <w:bookmarkStart w:id="1" w:name="_Toc1708"/>
       <w:r>
         <w:rPr>
           <w:rFonts w:hint="eastAsia" w:cs="华文中宋"/>
@@ -1993,12 +1993,60 @@
     <w:p>
       <w:pPr>
         <w:rPr>
+          <w:rFonts w:hint="default" w:ascii="华文中宋" w:hAnsi="华文中宋" w:eastAsia="华文中宋" w:cs="华文中宋"/>
+          <w:b/>
+          <w:bCs/>
+          <w:color w:val="FF0000"/>
+          <w:spacing w:val="7"/>
+          <w:kern w:val="2"/>
+          <w:sz w:val="21"/>
+          <w:szCs w:val="21"/>
+          <w:lang w:val="en-US" w:eastAsia="zh-CN" w:bidi="ar-SA"/>
+        </w:rPr>
+      </w:pPr>
+      <w:bookmarkStart w:id="19" w:name="_GoBack"/>
+      <w:bookmarkEnd w:id="19"/>
+    </w:p>
+    <w:p>
+      <w:pPr>
+        <w:rPr>
+          <w:rFonts w:hint="default" w:ascii="华文中宋" w:hAnsi="华文中宋" w:eastAsia="华文中宋" w:cs="华文中宋"/>
+          <w:b/>
+          <w:bCs/>
+          <w:color w:val="FF0000"/>
+          <w:spacing w:val="7"/>
+          <w:kern w:val="2"/>
+          <w:sz w:val="21"/>
+          <w:szCs w:val="21"/>
+          <w:lang w:val="en-US" w:eastAsia="zh-CN" w:bidi="ar-SA"/>
+        </w:rPr>
+      </w:pPr>
+    </w:p>
+    <w:p>
+      <w:pPr>
+        <w:outlineLvl w:val="0"/>
+        <w:rPr>
           <w:rFonts w:cs="华文中宋"/>
           <w:bCs/>
-          <w:color w:val="0070C0"/>
+          <w:color w:val="FF0000"/>
           <w:spacing w:val="7"/>
         </w:rPr>
       </w:pPr>
+      <w:r>
+        <w:rPr>
+          <w:rFonts w:hint="eastAsia" w:cs="华文中宋"/>
+          <w:bCs/>
+          <w:color w:val="70AD47" w:themeColor="accent6"/>
+          <w:szCs w:val="24"/>
+          <w:lang w:val="en-US" w:eastAsia="zh-CN"/>
+          <w14:textFill>
+            <w14:solidFill>
+              <w14:schemeClr w14:val="accent6"/>
+            </w14:solidFill>
+          </w14:textFill>
+        </w:rPr>
+        <w:t>并发concurrent.future：</w:t>
+      </w:r>
     </w:p>
     <w:tbl>
       <w:tblPr>
@@ -2022,9 +2070,408 @@
         </w:tblCellMar>
       </w:tblPr>
       <w:tblGrid>
+        <w:gridCol w:w="1579"/>
+        <w:gridCol w:w="4959"/>
+        <w:gridCol w:w="4028"/>
+      </w:tblGrid>
+      <w:tr>
+        <w:tblPrEx>
+          <w:tblBorders>
+            <w:top w:val="single" w:color="auto" w:sz="4" w:space="0"/>
+            <w:left w:val="single" w:color="auto" w:sz="4" w:space="0"/>
+            <w:bottom w:val="single" w:color="auto" w:sz="4" w:space="0"/>
+            <w:right w:val="single" w:color="auto" w:sz="4" w:space="0"/>
+            <w:insideH w:val="single" w:color="auto" w:sz="4" w:space="0"/>
+            <w:insideV w:val="single" w:color="auto" w:sz="4" w:space="0"/>
+          </w:tblBorders>
+        </w:tblPrEx>
+        <w:tc>
+          <w:tcPr>
+            <w:tcW w:w="0" w:type="auto"/>
+            <w:gridSpan w:val="2"/>
+            <w:vAlign w:val="center"/>
+          </w:tcPr>
+          <w:p>
+            <w:pPr>
+              <w:rPr>
+                <w:rFonts w:cs="华文中宋"/>
+                <w:bCs/>
+                <w:color w:val="FFC000"/>
+                <w:spacing w:val="7"/>
+              </w:rPr>
+            </w:pPr>
+            <w:r>
+              <w:rPr>
+                <w:rFonts w:hint="eastAsia" w:cs="华文中宋"/>
+                <w:bCs/>
+                <w:color w:val="FF0000"/>
+                <w:spacing w:val="7"/>
+              </w:rPr>
+              <w:t>ThreadPoolExecutor</w:t>
+            </w:r>
+            <w:r>
+              <w:rPr>
+                <w:rFonts w:hint="eastAsia" w:cs="华文中宋"/>
+                <w:bCs/>
+                <w:color w:val="FF0000"/>
+                <w:spacing w:val="7"/>
+                <w:lang w:val="en-US" w:eastAsia="zh-CN"/>
+              </w:rPr>
+              <w:t xml:space="preserve"> / ProcessPoolExecutor</w:t>
+            </w:r>
+            <w:r>
+              <w:rPr>
+                <w:rFonts w:hint="eastAsia" w:cs="华文中宋"/>
+                <w:bCs/>
+                <w:color w:val="FF0000"/>
+                <w:spacing w:val="7"/>
+              </w:rPr>
+              <w:t>(max_workers)</w:t>
+            </w:r>
+          </w:p>
+        </w:tc>
+        <w:tc>
+          <w:tcPr>
+            <w:tcW w:w="0" w:type="auto"/>
+            <w:vAlign w:val="center"/>
+          </w:tcPr>
+          <w:p>
+            <w:pPr>
+              <w:rPr>
+                <w:rFonts w:hint="default" w:eastAsia="华文中宋" w:cs="华文中宋"/>
+                <w:bCs/>
+                <w:color w:val="ED7D31" w:themeColor="accent2"/>
+                <w:spacing w:val="7"/>
+                <w:lang w:val="en-US" w:eastAsia="zh-CN"/>
+                <w14:textFill>
+                  <w14:solidFill>
+                    <w14:schemeClr w14:val="accent2"/>
+                  </w14:solidFill>
+                </w14:textFill>
+              </w:rPr>
+            </w:pPr>
+            <w:r>
+              <w:rPr>
+                <w:rFonts w:hint="eastAsia" w:cs="华文中宋"/>
+                <w:bCs/>
+                <w:color w:val="EA82F1"/>
+                <w:spacing w:val="7"/>
+              </w:rPr>
+              <w:t>线程池</w:t>
+            </w:r>
+            <w:r>
+              <w:rPr>
+                <w:rFonts w:hint="eastAsia" w:cs="华文中宋"/>
+                <w:bCs/>
+                <w:color w:val="EA82F1"/>
+                <w:spacing w:val="7"/>
+                <w:lang w:val="en-US" w:eastAsia="zh-CN"/>
+              </w:rPr>
+              <w:t xml:space="preserve"> / 进程池</w:t>
+            </w:r>
+          </w:p>
+        </w:tc>
+      </w:tr>
+      <w:tr>
+        <w:tblPrEx>
+          <w:tblBorders>
+            <w:top w:val="single" w:color="auto" w:sz="4" w:space="0"/>
+            <w:left w:val="single" w:color="auto" w:sz="4" w:space="0"/>
+            <w:bottom w:val="single" w:color="auto" w:sz="4" w:space="0"/>
+            <w:right w:val="single" w:color="auto" w:sz="4" w:space="0"/>
+            <w:insideH w:val="single" w:color="auto" w:sz="4" w:space="0"/>
+            <w:insideV w:val="single" w:color="auto" w:sz="4" w:space="0"/>
+          </w:tblBorders>
+          <w:tblCellMar>
+            <w:top w:w="0" w:type="dxa"/>
+            <w:left w:w="108" w:type="dxa"/>
+            <w:bottom w:w="0" w:type="dxa"/>
+            <w:right w:w="108" w:type="dxa"/>
+          </w:tblCellMar>
+        </w:tblPrEx>
+        <w:tc>
+          <w:tcPr>
+            <w:tcW w:w="0" w:type="auto"/>
+            <w:vMerge w:val="restart"/>
+            <w:vAlign w:val="center"/>
+          </w:tcPr>
+          <w:p>
+            <w:pPr>
+              <w:rPr>
+                <w:rFonts w:cs="华文中宋"/>
+                <w:bCs/>
+                <w:color w:val="FFC000"/>
+                <w:spacing w:val="7"/>
+              </w:rPr>
+            </w:pPr>
+            <w:r>
+              <w:rPr>
+                <w:rFonts w:hint="eastAsia" w:cs="华文中宋"/>
+                <w:bCs/>
+                <w:color w:val="ED7D31" w:themeColor="accent2"/>
+                <w:spacing w:val="7"/>
+                <w14:textFill>
+                  <w14:solidFill>
+                    <w14:schemeClr w14:val="accent2"/>
+                  </w14:solidFill>
+                </w14:textFill>
+              </w:rPr>
+              <w:t>实例方法</w:t>
+            </w:r>
+          </w:p>
+        </w:tc>
+        <w:tc>
+          <w:tcPr>
+            <w:tcW w:w="0" w:type="auto"/>
+            <w:vAlign w:val="center"/>
+          </w:tcPr>
+          <w:p>
+            <w:pPr>
+              <w:rPr>
+                <w:rFonts w:cs="华文中宋"/>
+                <w:bCs/>
+                <w:color w:val="FF0000"/>
+                <w:spacing w:val="7"/>
+              </w:rPr>
+            </w:pPr>
+            <w:r>
+              <w:rPr>
+                <w:rFonts w:hint="eastAsia" w:cs="华文中宋"/>
+                <w:bCs/>
+                <w:color w:val="FF0000"/>
+                <w:spacing w:val="7"/>
+              </w:rPr>
+              <w:t>submit(func, *args, **kwargs)</w:t>
+            </w:r>
+          </w:p>
+        </w:tc>
+        <w:tc>
+          <w:tcPr>
+            <w:tcW w:w="0" w:type="auto"/>
+            <w:vAlign w:val="center"/>
+          </w:tcPr>
+          <w:p>
+            <w:pPr>
+              <w:rPr>
+                <w:rFonts w:cs="华文中宋"/>
+                <w:bCs/>
+                <w:color w:val="ED7D31" w:themeColor="accent2"/>
+                <w:spacing w:val="7"/>
+                <w14:textFill>
+                  <w14:solidFill>
+                    <w14:schemeClr w14:val="accent2"/>
+                  </w14:solidFill>
+                </w14:textFill>
+              </w:rPr>
+            </w:pPr>
+            <w:r>
+              <w:rPr>
+                <w:rFonts w:hint="eastAsia" w:cs="华文中宋"/>
+                <w:bCs/>
+                <w:color w:val="ED7D31" w:themeColor="accent2"/>
+                <w:spacing w:val="7"/>
+                <w14:textFill>
+                  <w14:solidFill>
+                    <w14:schemeClr w14:val="accent2"/>
+                  </w14:solidFill>
+                </w14:textFill>
+              </w:rPr>
+              <w:t>生成</w:t>
+            </w:r>
+            <w:r>
+              <w:rPr>
+                <w:rFonts w:hint="eastAsia" w:cs="华文中宋"/>
+                <w:bCs/>
+                <w:color w:val="EA82EB"/>
+                <w:spacing w:val="7"/>
+              </w:rPr>
+              <w:t>后台单线程</w:t>
+            </w:r>
+            <w:r>
+              <w:rPr>
+                <w:rFonts w:hint="eastAsia" w:cs="华文中宋"/>
+                <w:bCs/>
+                <w:color w:val="ED7D31" w:themeColor="accent2"/>
+                <w:spacing w:val="7"/>
+                <w14:textFill>
+                  <w14:solidFill>
+                    <w14:schemeClr w14:val="accent2"/>
+                  </w14:solidFill>
+                </w14:textFill>
+              </w:rPr>
+              <w:t>，返回</w:t>
+            </w:r>
+            <w:r>
+              <w:rPr>
+                <w:rFonts w:hint="eastAsia" w:cs="华文中宋"/>
+                <w:bCs/>
+                <w:color w:val="EA82EB"/>
+                <w:spacing w:val="7"/>
+              </w:rPr>
+              <w:t>Future线程</w:t>
+            </w:r>
+          </w:p>
+        </w:tc>
+      </w:tr>
+      <w:tr>
+        <w:tblPrEx>
+          <w:tblBorders>
+            <w:top w:val="single" w:color="auto" w:sz="4" w:space="0"/>
+            <w:left w:val="single" w:color="auto" w:sz="4" w:space="0"/>
+            <w:bottom w:val="single" w:color="auto" w:sz="4" w:space="0"/>
+            <w:right w:val="single" w:color="auto" w:sz="4" w:space="0"/>
+            <w:insideH w:val="single" w:color="auto" w:sz="4" w:space="0"/>
+            <w:insideV w:val="single" w:color="auto" w:sz="4" w:space="0"/>
+          </w:tblBorders>
+          <w:tblCellMar>
+            <w:top w:w="0" w:type="dxa"/>
+            <w:left w:w="108" w:type="dxa"/>
+            <w:bottom w:w="0" w:type="dxa"/>
+            <w:right w:w="108" w:type="dxa"/>
+          </w:tblCellMar>
+        </w:tblPrEx>
+        <w:tc>
+          <w:tcPr>
+            <w:tcW w:w="0" w:type="auto"/>
+            <w:vMerge w:val="continue"/>
+            <w:vAlign w:val="center"/>
+          </w:tcPr>
+          <w:p>
+            <w:pPr>
+              <w:rPr>
+                <w:rFonts w:cs="华文中宋"/>
+                <w:bCs/>
+                <w:color w:val="ED7D31" w:themeColor="accent2"/>
+                <w:spacing w:val="7"/>
+                <w14:textFill>
+                  <w14:solidFill>
+                    <w14:schemeClr w14:val="accent2"/>
+                  </w14:solidFill>
+                </w14:textFill>
+              </w:rPr>
+            </w:pPr>
+          </w:p>
+        </w:tc>
+        <w:tc>
+          <w:tcPr>
+            <w:tcW w:w="0" w:type="auto"/>
+            <w:vAlign w:val="center"/>
+          </w:tcPr>
+          <w:p>
+            <w:pPr>
+              <w:rPr>
+                <w:rFonts w:cs="华文中宋"/>
+                <w:bCs/>
+                <w:color w:val="FF0000"/>
+                <w:spacing w:val="7"/>
+              </w:rPr>
+            </w:pPr>
+            <w:r>
+              <w:rPr>
+                <w:rFonts w:hint="eastAsia" w:cs="华文中宋"/>
+                <w:bCs/>
+                <w:color w:val="FF0000"/>
+                <w:spacing w:val="7"/>
+              </w:rPr>
+              <w:t>map(func, *iterables, timeout)</w:t>
+            </w:r>
+          </w:p>
+        </w:tc>
+        <w:tc>
+          <w:tcPr>
+            <w:tcW w:w="0" w:type="auto"/>
+            <w:vAlign w:val="center"/>
+          </w:tcPr>
+          <w:p>
+            <w:pPr>
+              <w:rPr>
+                <w:rFonts w:cs="华文中宋"/>
+                <w:bCs/>
+                <w:color w:val="ED7D31" w:themeColor="accent2"/>
+                <w:spacing w:val="7"/>
+                <w14:textFill>
+                  <w14:solidFill>
+                    <w14:schemeClr w14:val="accent2"/>
+                  </w14:solidFill>
+                </w14:textFill>
+              </w:rPr>
+            </w:pPr>
+            <w:r>
+              <w:rPr>
+                <w:rFonts w:hint="eastAsia" w:cs="华文中宋"/>
+                <w:bCs/>
+                <w:color w:val="ED7D31" w:themeColor="accent2"/>
+                <w:spacing w:val="7"/>
+                <w14:textFill>
+                  <w14:solidFill>
+                    <w14:schemeClr w14:val="accent2"/>
+                  </w14:solidFill>
+                </w14:textFill>
+              </w:rPr>
+              <w:t>生成</w:t>
+            </w:r>
+            <w:r>
+              <w:rPr>
+                <w:rFonts w:hint="eastAsia" w:cs="华文中宋"/>
+                <w:bCs/>
+                <w:color w:val="EA82EB"/>
+                <w:spacing w:val="7"/>
+              </w:rPr>
+              <w:t>后台多线程</w:t>
+            </w:r>
+            <w:r>
+              <w:rPr>
+                <w:rFonts w:hint="eastAsia" w:cs="华文中宋"/>
+                <w:bCs/>
+                <w:color w:val="ED7D31" w:themeColor="accent2"/>
+                <w:spacing w:val="7"/>
+                <w14:textFill>
+                  <w14:solidFill>
+                    <w14:schemeClr w14:val="accent2"/>
+                  </w14:solidFill>
+                </w14:textFill>
+              </w:rPr>
+              <w:t>，返回</w:t>
+            </w:r>
+            <w:r>
+              <w:rPr>
+                <w:rFonts w:hint="eastAsia" w:cs="华文中宋"/>
+                <w:bCs/>
+                <w:color w:val="EA82EB"/>
+                <w:spacing w:val="7"/>
+              </w:rPr>
+              <w:t>映射结果迭代器</w:t>
+            </w:r>
+          </w:p>
+        </w:tc>
+      </w:tr>
+    </w:tbl>
+    <w:p/>
+    <w:tbl>
+      <w:tblPr>
+        <w:tblStyle w:val="11"/>
+        <w:tblW w:w="0" w:type="auto"/>
+        <w:tblInd w:w="0" w:type="dxa"/>
+        <w:tblBorders>
+          <w:top w:val="single" w:color="auto" w:sz="4" w:space="0"/>
+          <w:left w:val="single" w:color="auto" w:sz="4" w:space="0"/>
+          <w:bottom w:val="single" w:color="auto" w:sz="4" w:space="0"/>
+          <w:right w:val="single" w:color="auto" w:sz="4" w:space="0"/>
+          <w:insideH w:val="single" w:color="auto" w:sz="4" w:space="0"/>
+          <w:insideV w:val="single" w:color="auto" w:sz="4" w:space="0"/>
+        </w:tblBorders>
+        <w:tblLayout w:type="autofit"/>
+        <w:tblCellMar>
+          <w:top w:w="0" w:type="dxa"/>
+          <w:left w:w="108" w:type="dxa"/>
+          <w:bottom w:w="0" w:type="dxa"/>
+          <w:right w:w="108" w:type="dxa"/>
+        </w:tblCellMar>
+      </w:tblPr>
+      <w:tblGrid>
         <w:gridCol w:w="1113"/>
-        <w:gridCol w:w="997"/>
-        <w:gridCol w:w="1113"/>
+        <w:gridCol w:w="2636"/>
+        <w:gridCol w:w="1562"/>
       </w:tblGrid>
       <w:tr>
         <w:tblPrEx>
@@ -2046,54 +2493,50 @@
         <w:tc>
           <w:tcPr>
             <w:tcW w:w="0" w:type="auto"/>
-            <w:gridSpan w:val="3"/>
-            <w:vAlign w:val="center"/>
-          </w:tcPr>
-          <w:p>
-            <w:pPr>
-              <w:jc w:val="both"/>
+            <w:gridSpan w:val="2"/>
+            <w:vAlign w:val="center"/>
+          </w:tcPr>
+          <w:p>
+            <w:pPr>
               <w:rPr>
                 <w:rFonts w:hint="eastAsia" w:eastAsia="华文中宋" w:cs="华文中宋"/>
                 <w:bCs/>
-                <w:color w:val="ED7D31" w:themeColor="accent2"/>
-                <w:spacing w:val="7"/>
-                <w:lang w:val="en-US" w:eastAsia="zh-CN"/>
-                <w14:textFill>
-                  <w14:solidFill>
-                    <w14:schemeClr w14:val="accent2"/>
-                  </w14:solidFill>
-                </w14:textFill>
-              </w:rPr>
-            </w:pPr>
-            <w:r>
-              <w:rPr>
-                <w:rFonts w:hint="eastAsia" w:cs="华文中宋"/>
-                <w:bCs/>
-                <w:color w:val="ED7D31" w:themeColor="accent2"/>
-                <w:spacing w:val="7"/>
-                <w14:textFill>
-                  <w14:solidFill>
-                    <w14:schemeClr w14:val="accent2"/>
-                  </w14:solidFill>
-                </w14:textFill>
-              </w:rPr>
-              <w:t>任务</w:t>
-            </w:r>
-            <w:r>
-              <w:rPr>
-                <w:rFonts w:hint="eastAsia" w:cs="华文中宋"/>
-                <w:bCs/>
-                <w:color w:val="ED7D31" w:themeColor="accent2"/>
-                <w:spacing w:val="7"/>
-                <w:lang w:eastAsia="zh-CN"/>
-                <w14:textFill>
-                  <w14:solidFill>
-                    <w14:schemeClr w14:val="accent2"/>
-                  </w14:solidFill>
-                </w14:textFill>
-              </w:rPr>
-              <w:t>：</w:t>
-            </w:r>
+                <w:color w:val="FF0000"/>
+                <w:spacing w:val="7"/>
+                <w:lang w:val="en-US" w:eastAsia="zh-CN"/>
+              </w:rPr>
+            </w:pPr>
+            <w:r>
+              <w:rPr>
+                <w:rFonts w:hint="eastAsia" w:cs="华文中宋"/>
+                <w:bCs/>
+                <w:color w:val="FF0000"/>
+                <w:spacing w:val="7"/>
+                <w:lang w:val="en-US" w:eastAsia="zh-CN"/>
+              </w:rPr>
+              <w:t>Future</w:t>
+            </w:r>
+          </w:p>
+        </w:tc>
+        <w:tc>
+          <w:tcPr>
+            <w:tcW w:w="0" w:type="auto"/>
+            <w:vAlign w:val="center"/>
+          </w:tcPr>
+          <w:p>
+            <w:pPr>
+              <w:rPr>
+                <w:rFonts w:hint="eastAsia" w:cs="华文中宋"/>
+                <w:bCs/>
+                <w:color w:val="ED7D31" w:themeColor="accent2"/>
+                <w:spacing w:val="7"/>
+                <w14:textFill>
+                  <w14:solidFill>
+                    <w14:schemeClr w14:val="accent2"/>
+                  </w14:solidFill>
+                </w14:textFill>
+              </w:rPr>
+            </w:pPr>
           </w:p>
         </w:tc>
       </w:tr>
@@ -2117,12 +2560,47 @@
         <w:tc>
           <w:tcPr>
             <w:tcW w:w="0" w:type="auto"/>
-            <w:gridSpan w:val="2"/>
-            <w:vAlign w:val="center"/>
-          </w:tcPr>
-          <w:p>
-            <w:pPr>
-              <w:jc w:val="both"/>
+            <w:vAlign w:val="center"/>
+          </w:tcPr>
+          <w:p>
+            <w:pPr>
+              <w:rPr>
+                <w:rFonts w:hint="default" w:cs="华文中宋"/>
+                <w:bCs/>
+                <w:color w:val="ED7D31" w:themeColor="accent2"/>
+                <w:spacing w:val="7"/>
+                <w:lang w:val="en-US" w:eastAsia="zh-CN"/>
+                <w14:textFill>
+                  <w14:solidFill>
+                    <w14:schemeClr w14:val="accent2"/>
+                  </w14:solidFill>
+                </w14:textFill>
+              </w:rPr>
+            </w:pPr>
+            <w:r>
+              <w:rPr>
+                <w:rFonts w:hint="eastAsia" w:cs="华文中宋"/>
+                <w:bCs/>
+                <w:color w:val="ED7D31" w:themeColor="accent2"/>
+                <w:spacing w:val="7"/>
+                <w:lang w:val="en-US" w:eastAsia="zh-CN"/>
+                <w14:textFill>
+                  <w14:solidFill>
+                    <w14:schemeClr w14:val="accent2"/>
+                  </w14:solidFill>
+                </w14:textFill>
+              </w:rPr>
+              <w:t>实例属性</w:t>
+            </w:r>
+          </w:p>
+        </w:tc>
+        <w:tc>
+          <w:tcPr>
+            <w:tcW w:w="0" w:type="auto"/>
+            <w:vAlign w:val="center"/>
+          </w:tcPr>
+          <w:p>
+            <w:pPr>
               <w:rPr>
                 <w:rFonts w:hint="default" w:eastAsia="华文中宋" w:cs="华文中宋"/>
                 <w:bCs/>
@@ -2139,31 +2617,40 @@
                 <w:spacing w:val="7"/>
                 <w:lang w:val="en-US" w:eastAsia="zh-CN"/>
               </w:rPr>
-              <w:t>Future / Task</w:t>
-            </w:r>
-          </w:p>
-        </w:tc>
-        <w:tc>
-          <w:tcPr>
-            <w:tcW w:w="0" w:type="auto"/>
-            <w:vAlign w:val="center"/>
-          </w:tcPr>
-          <w:p>
-            <w:pPr>
-              <w:jc w:val="both"/>
-              <w:rPr>
-                <w:rFonts w:hint="eastAsia" w:cs="华文中宋"/>
-                <w:bCs/>
-                <w:color w:val="ED7D31" w:themeColor="accent2"/>
-                <w:spacing w:val="7"/>
-                <w:lang w:val="en-US" w:eastAsia="zh-CN"/>
-                <w14:textFill>
-                  <w14:solidFill>
-                    <w14:schemeClr w14:val="accent2"/>
-                  </w14:solidFill>
-                </w14:textFill>
-              </w:rPr>
-            </w:pPr>
+              <w:t>running / done()</w:t>
+            </w:r>
+          </w:p>
+        </w:tc>
+        <w:tc>
+          <w:tcPr>
+            <w:tcW w:w="0" w:type="auto"/>
+            <w:vAlign w:val="center"/>
+          </w:tcPr>
+          <w:p>
+            <w:pPr>
+              <w:rPr>
+                <w:rFonts w:hint="eastAsia" w:eastAsia="华文中宋" w:cs="华文中宋"/>
+                <w:bCs/>
+                <w:color w:val="ED7D31" w:themeColor="accent2"/>
+                <w:spacing w:val="7"/>
+                <w:lang w:val="en-US" w:eastAsia="zh-CN"/>
+                <w14:textFill>
+                  <w14:solidFill>
+                    <w14:schemeClr w14:val="accent2"/>
+                  </w14:solidFill>
+                </w14:textFill>
+              </w:rPr>
+            </w:pPr>
+            <w:r>
+              <w:rPr>
+                <w:rFonts w:hint="eastAsia" w:cs="华文中宋"/>
+                <w:bCs/>
+                <w:color w:val="EA82EB"/>
+                <w:spacing w:val="7"/>
+                <w:lang w:val="en-US" w:eastAsia="zh-CN"/>
+              </w:rPr>
+              <w:t>状态</w:t>
+            </w:r>
           </w:p>
         </w:tc>
       </w:tr>
@@ -2192,81 +2679,108 @@
           </w:tcPr>
           <w:p>
             <w:pPr>
-              <w:jc w:val="both"/>
-              <w:rPr>
-                <w:rFonts w:cs="华文中宋"/>
-                <w:bCs/>
-                <w:color w:val="FF0000"/>
-                <w:spacing w:val="7"/>
-              </w:rPr>
-            </w:pPr>
-            <w:r>
-              <w:rPr>
-                <w:rFonts w:hint="eastAsia" w:cs="华文中宋"/>
-                <w:bCs/>
-                <w:color w:val="ED7D31" w:themeColor="accent2"/>
-                <w:spacing w:val="7"/>
-                <w14:textFill>
-                  <w14:solidFill>
-                    <w14:schemeClr w14:val="accent2"/>
-                  </w14:solidFill>
-                </w14:textFill>
-              </w:rPr>
-              <w:t>实例方法</w:t>
-            </w:r>
-          </w:p>
-        </w:tc>
-        <w:tc>
-          <w:tcPr>
-            <w:tcW w:w="0" w:type="auto"/>
-            <w:vAlign w:val="center"/>
-          </w:tcPr>
-          <w:p>
-            <w:pPr>
-              <w:jc w:val="both"/>
-              <w:rPr>
-                <w:rFonts w:hint="eastAsia" w:ascii="华文中宋" w:hAnsi="华文中宋" w:eastAsia="华文中宋" w:cs="华文中宋"/>
-                <w:b/>
-                <w:bCs/>
-                <w:color w:val="FF0000"/>
-                <w:spacing w:val="7"/>
-                <w:kern w:val="2"/>
-                <w:sz w:val="21"/>
-                <w:szCs w:val="21"/>
-                <w:lang w:val="en-US" w:eastAsia="zh-CN" w:bidi="ar-SA"/>
-              </w:rPr>
-            </w:pPr>
-            <w:r>
-              <w:rPr>
-                <w:rFonts w:hint="eastAsia" w:cs="华文中宋"/>
-                <w:bCs/>
-                <w:color w:val="FF0000"/>
-                <w:spacing w:val="7"/>
-              </w:rPr>
-              <w:t>result()</w:t>
-            </w:r>
-          </w:p>
-        </w:tc>
-        <w:tc>
-          <w:tcPr>
-            <w:tcW w:w="0" w:type="auto"/>
-            <w:vAlign w:val="center"/>
-          </w:tcPr>
-          <w:p>
-            <w:pPr>
-              <w:jc w:val="both"/>
-              <w:rPr>
-                <w:rFonts w:cs="华文中宋"/>
-                <w:bCs/>
-                <w:color w:val="EA82F1"/>
-                <w:spacing w:val="7"/>
-              </w:rPr>
-            </w:pPr>
-            <w:r>
-              <w:rPr>
-                <w:rFonts w:hint="eastAsia" w:cs="华文中宋"/>
-                <w:bCs/>
-                <w:color w:val="EA82F1"/>
+              <w:rPr>
+                <w:rFonts w:cs="华文中宋"/>
+                <w:bCs/>
+                <w:color w:val="FFC000"/>
+                <w:spacing w:val="7"/>
+              </w:rPr>
+            </w:pPr>
+            <w:r>
+              <w:rPr>
+                <w:rFonts w:hint="eastAsia" w:cs="华文中宋"/>
+                <w:bCs/>
+                <w:color w:val="ED7D31" w:themeColor="accent2"/>
+                <w:spacing w:val="7"/>
+                <w:lang w:val="en-US" w:eastAsia="zh-CN"/>
+                <w14:textFill>
+                  <w14:solidFill>
+                    <w14:schemeClr w14:val="accent2"/>
+                  </w14:solidFill>
+                </w14:textFill>
+              </w:rPr>
+              <w:t>实例</w:t>
+            </w:r>
+            <w:r>
+              <w:rPr>
+                <w:rFonts w:hint="eastAsia" w:cs="华文中宋"/>
+                <w:bCs/>
+                <w:color w:val="ED7D31" w:themeColor="accent2"/>
+                <w:spacing w:val="7"/>
+                <w14:textFill>
+                  <w14:solidFill>
+                    <w14:schemeClr w14:val="accent2"/>
+                  </w14:solidFill>
+                </w14:textFill>
+              </w:rPr>
+              <w:t>方法</w:t>
+            </w:r>
+          </w:p>
+        </w:tc>
+        <w:tc>
+          <w:tcPr>
+            <w:tcW w:w="0" w:type="auto"/>
+            <w:vAlign w:val="center"/>
+          </w:tcPr>
+          <w:p>
+            <w:pPr>
+              <w:rPr>
+                <w:rFonts w:cs="华文中宋"/>
+                <w:bCs/>
+                <w:color w:val="FF0000"/>
+                <w:spacing w:val="7"/>
+              </w:rPr>
+            </w:pPr>
+            <w:r>
+              <w:rPr>
+                <w:rFonts w:hint="eastAsia" w:cs="华文中宋"/>
+                <w:bCs/>
+                <w:color w:val="FF0000"/>
+                <w:spacing w:val="7"/>
+              </w:rPr>
+              <w:t>result(timeout)</w:t>
+            </w:r>
+          </w:p>
+        </w:tc>
+        <w:tc>
+          <w:tcPr>
+            <w:tcW w:w="0" w:type="auto"/>
+            <w:vAlign w:val="center"/>
+          </w:tcPr>
+          <w:p>
+            <w:pPr>
+              <w:rPr>
+                <w:rFonts w:cs="华文中宋"/>
+                <w:bCs/>
+                <w:color w:val="ED7D31" w:themeColor="accent2"/>
+                <w:spacing w:val="7"/>
+                <w14:textFill>
+                  <w14:solidFill>
+                    <w14:schemeClr w14:val="accent2"/>
+                  </w14:solidFill>
+                </w14:textFill>
+              </w:rPr>
+            </w:pPr>
+            <w:r>
+              <w:rPr>
+                <w:rFonts w:hint="eastAsia" w:cs="华文中宋"/>
+                <w:bCs/>
+                <w:color w:val="ED7D31" w:themeColor="accent2"/>
+                <w:spacing w:val="7"/>
+                <w:lang w:val="en-US" w:eastAsia="zh-CN"/>
+                <w14:textFill>
+                  <w14:solidFill>
+                    <w14:schemeClr w14:val="accent2"/>
+                  </w14:solidFill>
+                </w14:textFill>
+              </w:rPr>
+              <w:t>阻塞等待</w:t>
+            </w:r>
+            <w:r>
+              <w:rPr>
+                <w:rFonts w:hint="eastAsia" w:cs="华文中宋"/>
+                <w:bCs/>
+                <w:color w:val="EA82EB"/>
                 <w:spacing w:val="7"/>
               </w:rPr>
               <w:t>结果</w:t>
@@ -2295,94 +2809,102 @@
           <w:tcPr>
             <w:tcW w:w="0" w:type="auto"/>
             <w:vMerge w:val="continue"/>
-            <w:vAlign w:val="center"/>
-          </w:tcPr>
-          <w:p>
-            <w:pPr>
-              <w:jc w:val="both"/>
-              <w:rPr>
-                <w:rFonts w:cs="华文中宋"/>
-                <w:bCs/>
-                <w:color w:val="FF0000"/>
-                <w:spacing w:val="7"/>
-              </w:rPr>
-            </w:pPr>
-          </w:p>
-        </w:tc>
-        <w:tc>
-          <w:tcPr>
-            <w:tcW w:w="0" w:type="auto"/>
-            <w:vAlign w:val="center"/>
-          </w:tcPr>
-          <w:p>
-            <w:pPr>
-              <w:jc w:val="both"/>
-              <w:rPr>
-                <w:rFonts w:hint="eastAsia" w:ascii="华文中宋" w:hAnsi="华文中宋" w:eastAsia="华文中宋" w:cs="华文中宋"/>
-                <w:b/>
-                <w:bCs/>
-                <w:color w:val="FF0000"/>
-                <w:spacing w:val="7"/>
-                <w:kern w:val="2"/>
-                <w:sz w:val="21"/>
-                <w:szCs w:val="21"/>
-                <w:lang w:val="en-US" w:eastAsia="zh-CN" w:bidi="ar-SA"/>
-              </w:rPr>
-            </w:pPr>
-            <w:r>
-              <w:rPr>
-                <w:rFonts w:hint="eastAsia" w:cs="华文中宋"/>
-                <w:bCs/>
-                <w:color w:val="FF0000"/>
-                <w:spacing w:val="7"/>
-              </w:rPr>
-              <w:t>done()</w:t>
-            </w:r>
-          </w:p>
-        </w:tc>
-        <w:tc>
-          <w:tcPr>
-            <w:tcW w:w="0" w:type="auto"/>
-            <w:vAlign w:val="center"/>
-          </w:tcPr>
-          <w:p>
-            <w:pPr>
-              <w:jc w:val="both"/>
-              <w:rPr>
-                <w:rFonts w:cs="华文中宋"/>
-                <w:bCs/>
-                <w:color w:val="EA82F1"/>
-                <w:spacing w:val="7"/>
-              </w:rPr>
-            </w:pPr>
-            <w:r>
-              <w:rPr>
-                <w:rFonts w:hint="eastAsia" w:cs="华文中宋"/>
-                <w:bCs/>
-                <w:color w:val="EA82F1"/>
-                <w:spacing w:val="7"/>
-              </w:rPr>
-              <w:t>完成情况</w:t>
+            <w:tcBorders/>
+            <w:vAlign w:val="center"/>
+          </w:tcPr>
+          <w:p>
+            <w:pPr>
+              <w:rPr>
+                <w:rFonts w:hint="eastAsia" w:cs="华文中宋"/>
+                <w:bCs/>
+                <w:color w:val="ED7D31" w:themeColor="accent2"/>
+                <w:spacing w:val="7"/>
+                <w:lang w:val="en-US" w:eastAsia="zh-CN"/>
+                <w14:textFill>
+                  <w14:solidFill>
+                    <w14:schemeClr w14:val="accent2"/>
+                  </w14:solidFill>
+                </w14:textFill>
+              </w:rPr>
+            </w:pPr>
+          </w:p>
+        </w:tc>
+        <w:tc>
+          <w:tcPr>
+            <w:tcW w:w="0" w:type="auto"/>
+            <w:vAlign w:val="center"/>
+          </w:tcPr>
+          <w:p>
+            <w:pPr>
+              <w:rPr>
+                <w:rFonts w:hint="default" w:eastAsia="华文中宋" w:cs="华文中宋"/>
+                <w:bCs/>
+                <w:color w:val="FF0000"/>
+                <w:spacing w:val="7"/>
+                <w:lang w:val="en-US" w:eastAsia="zh-CN"/>
+              </w:rPr>
+            </w:pPr>
+            <w:r>
+              <w:rPr>
+                <w:rFonts w:hint="eastAsia" w:cs="华文中宋"/>
+                <w:bCs/>
+                <w:color w:val="FF0000"/>
+                <w:spacing w:val="7"/>
+                <w:lang w:val="en-US" w:eastAsia="zh-CN"/>
+              </w:rPr>
+              <w:t>add_done_callback(fn)</w:t>
+            </w:r>
+          </w:p>
+        </w:tc>
+        <w:tc>
+          <w:tcPr>
+            <w:tcW w:w="0" w:type="auto"/>
+            <w:vAlign w:val="center"/>
+          </w:tcPr>
+          <w:p>
+            <w:pPr>
+              <w:rPr>
+                <w:rFonts w:hint="default" w:cs="华文中宋"/>
+                <w:bCs/>
+                <w:color w:val="ED7D31" w:themeColor="accent2"/>
+                <w:spacing w:val="7"/>
+                <w:lang w:val="en-US" w:eastAsia="zh-CN"/>
+                <w14:textFill>
+                  <w14:solidFill>
+                    <w14:schemeClr w14:val="accent2"/>
+                  </w14:solidFill>
+                </w14:textFill>
+              </w:rPr>
+            </w:pPr>
+            <w:r>
+              <w:rPr>
+                <w:rFonts w:hint="eastAsia" w:cs="华文中宋"/>
+                <w:bCs/>
+                <w:color w:val="ED7D31" w:themeColor="accent2"/>
+                <w:spacing w:val="7"/>
+                <w:lang w:val="en-US" w:eastAsia="zh-CN"/>
+                <w14:textFill>
+                  <w14:solidFill>
+                    <w14:schemeClr w14:val="accent2"/>
+                  </w14:solidFill>
+                </w14:textFill>
+              </w:rPr>
+              <w:t>添加</w:t>
+            </w:r>
+            <w:r>
+              <w:rPr>
+                <w:rFonts w:hint="eastAsia" w:cs="华文中宋"/>
+                <w:bCs/>
+                <w:color w:val="EA82EB"/>
+                <w:spacing w:val="7"/>
+                <w:lang w:val="en-US" w:eastAsia="zh-CN"/>
+              </w:rPr>
+              <w:t>回调</w:t>
             </w:r>
           </w:p>
         </w:tc>
       </w:tr>
     </w:tbl>
-    <w:p>
-      <w:pPr>
-        <w:rPr>
-          <w:rFonts w:hint="default" w:ascii="华文中宋" w:hAnsi="华文中宋" w:eastAsia="华文中宋" w:cs="华文中宋"/>
-          <w:b/>
-          <w:bCs/>
-          <w:color w:val="FF0000"/>
-          <w:spacing w:val="7"/>
-          <w:kern w:val="2"/>
-          <w:sz w:val="21"/>
-          <w:szCs w:val="21"/>
-          <w:lang w:val="en-US" w:eastAsia="zh-CN" w:bidi="ar-SA"/>
-        </w:rPr>
-      </w:pPr>
-    </w:p>
     <w:p>
       <w:pPr>
         <w:rPr>
@@ -5652,8 +6174,8 @@
           </w14:textFill>
         </w:rPr>
       </w:pPr>
-      <w:bookmarkStart w:id="6" w:name="_Toc27725"/>
-      <w:bookmarkStart w:id="7" w:name="_Toc31407"/>
+      <w:bookmarkStart w:id="6" w:name="_Toc31407"/>
+      <w:bookmarkStart w:id="7" w:name="_Toc27725"/>
       <w:r>
         <w:rPr>
           <w:rFonts w:hint="eastAsia" w:cs="华文中宋"/>
@@ -8854,6 +9376,12 @@
             <w:insideH w:val="single" w:color="auto" w:sz="4" w:space="0"/>
             <w:insideV w:val="single" w:color="auto" w:sz="4" w:space="0"/>
           </w:tblBorders>
+          <w:tblCellMar>
+            <w:top w:w="0" w:type="dxa"/>
+            <w:left w:w="108" w:type="dxa"/>
+            <w:bottom w:w="0" w:type="dxa"/>
+            <w:right w:w="108" w:type="dxa"/>
+          </w:tblCellMar>
         </w:tblPrEx>
         <w:tc>
           <w:tcPr>
@@ -9692,561 +10220,6 @@
                 </w14:textFill>
               </w:rPr>
               <w:t>当前进程</w:t>
-            </w:r>
-          </w:p>
-        </w:tc>
-      </w:tr>
-    </w:tbl>
-    <w:p>
-      <w:pPr>
-        <w:rPr>
-          <w:rFonts w:cs="华文中宋"/>
-          <w:bCs/>
-          <w:color w:val="FF0000"/>
-          <w:spacing w:val="7"/>
-        </w:rPr>
-      </w:pPr>
-    </w:p>
-    <w:tbl>
-      <w:tblPr>
-        <w:tblStyle w:val="11"/>
-        <w:tblW w:w="0" w:type="auto"/>
-        <w:tblInd w:w="0" w:type="dxa"/>
-        <w:tblBorders>
-          <w:top w:val="single" w:color="auto" w:sz="4" w:space="0"/>
-          <w:left w:val="single" w:color="auto" w:sz="4" w:space="0"/>
-          <w:bottom w:val="single" w:color="auto" w:sz="4" w:space="0"/>
-          <w:right w:val="single" w:color="auto" w:sz="4" w:space="0"/>
-          <w:insideH w:val="single" w:color="auto" w:sz="4" w:space="0"/>
-          <w:insideV w:val="single" w:color="auto" w:sz="4" w:space="0"/>
-        </w:tblBorders>
-        <w:tblLayout w:type="autofit"/>
-        <w:tblCellMar>
-          <w:top w:w="0" w:type="dxa"/>
-          <w:left w:w="108" w:type="dxa"/>
-          <w:bottom w:w="0" w:type="dxa"/>
-          <w:right w:w="108" w:type="dxa"/>
-        </w:tblCellMar>
-      </w:tblPr>
-      <w:tblGrid>
-        <w:gridCol w:w="1466"/>
-        <w:gridCol w:w="3495"/>
-        <w:gridCol w:w="4028"/>
-      </w:tblGrid>
-      <w:tr>
-        <w:tblPrEx>
-          <w:tblBorders>
-            <w:top w:val="single" w:color="auto" w:sz="4" w:space="0"/>
-            <w:left w:val="single" w:color="auto" w:sz="4" w:space="0"/>
-            <w:bottom w:val="single" w:color="auto" w:sz="4" w:space="0"/>
-            <w:right w:val="single" w:color="auto" w:sz="4" w:space="0"/>
-            <w:insideH w:val="single" w:color="auto" w:sz="4" w:space="0"/>
-            <w:insideV w:val="single" w:color="auto" w:sz="4" w:space="0"/>
-          </w:tblBorders>
-          <w:tblCellMar>
-            <w:top w:w="0" w:type="dxa"/>
-            <w:left w:w="108" w:type="dxa"/>
-            <w:bottom w:w="0" w:type="dxa"/>
-            <w:right w:w="108" w:type="dxa"/>
-          </w:tblCellMar>
-        </w:tblPrEx>
-        <w:tc>
-          <w:tcPr>
-            <w:tcW w:w="0" w:type="auto"/>
-            <w:gridSpan w:val="3"/>
-            <w:vAlign w:val="center"/>
-          </w:tcPr>
-          <w:p>
-            <w:pPr>
-              <w:rPr>
-                <w:rFonts w:cs="华文中宋"/>
-                <w:bCs/>
-                <w:color w:val="ED7D31" w:themeColor="accent2"/>
-                <w:spacing w:val="7"/>
-                <w14:textFill>
-                  <w14:solidFill>
-                    <w14:schemeClr w14:val="accent2"/>
-                  </w14:solidFill>
-                </w14:textFill>
-              </w:rPr>
-            </w:pPr>
-            <w:r>
-              <w:rPr>
-                <w:rFonts w:hint="eastAsia" w:cs="华文中宋"/>
-                <w:bCs/>
-                <w:color w:val="ED7D31" w:themeColor="accent2"/>
-                <w:spacing w:val="7"/>
-                <w14:textFill>
-                  <w14:solidFill>
-                    <w14:schemeClr w14:val="accent2"/>
-                  </w14:solidFill>
-                </w14:textFill>
-              </w:rPr>
-              <w:t>concurrent.futures线程池：</w:t>
-            </w:r>
-          </w:p>
-        </w:tc>
-      </w:tr>
-      <w:tr>
-        <w:tblPrEx>
-          <w:tblBorders>
-            <w:top w:val="single" w:color="auto" w:sz="4" w:space="0"/>
-            <w:left w:val="single" w:color="auto" w:sz="4" w:space="0"/>
-            <w:bottom w:val="single" w:color="auto" w:sz="4" w:space="0"/>
-            <w:right w:val="single" w:color="auto" w:sz="4" w:space="0"/>
-            <w:insideH w:val="single" w:color="auto" w:sz="4" w:space="0"/>
-            <w:insideV w:val="single" w:color="auto" w:sz="4" w:space="0"/>
-          </w:tblBorders>
-          <w:tblCellMar>
-            <w:top w:w="0" w:type="dxa"/>
-            <w:left w:w="108" w:type="dxa"/>
-            <w:bottom w:w="0" w:type="dxa"/>
-            <w:right w:w="108" w:type="dxa"/>
-          </w:tblCellMar>
-        </w:tblPrEx>
-        <w:tc>
-          <w:tcPr>
-            <w:tcW w:w="0" w:type="auto"/>
-            <w:gridSpan w:val="2"/>
-            <w:vAlign w:val="center"/>
-          </w:tcPr>
-          <w:p>
-            <w:pPr>
-              <w:rPr>
-                <w:rFonts w:cs="华文中宋"/>
-                <w:bCs/>
-                <w:color w:val="FFC000"/>
-                <w:spacing w:val="7"/>
-              </w:rPr>
-            </w:pPr>
-            <w:r>
-              <w:rPr>
-                <w:rFonts w:hint="eastAsia" w:cs="华文中宋"/>
-                <w:bCs/>
-                <w:color w:val="FFC000"/>
-                <w:spacing w:val="7"/>
-              </w:rPr>
-              <w:t>ThreadPoolExecutor(max_workers)</w:t>
-            </w:r>
-          </w:p>
-        </w:tc>
-        <w:tc>
-          <w:tcPr>
-            <w:tcW w:w="0" w:type="auto"/>
-            <w:vAlign w:val="center"/>
-          </w:tcPr>
-          <w:p>
-            <w:pPr>
-              <w:rPr>
-                <w:rFonts w:cs="华文中宋"/>
-                <w:bCs/>
-                <w:color w:val="ED7D31" w:themeColor="accent2"/>
-                <w:spacing w:val="7"/>
-                <w14:textFill>
-                  <w14:solidFill>
-                    <w14:schemeClr w14:val="accent2"/>
-                  </w14:solidFill>
-                </w14:textFill>
-              </w:rPr>
-            </w:pPr>
-            <w:r>
-              <w:rPr>
-                <w:rFonts w:hint="eastAsia" w:cs="华文中宋"/>
-                <w:bCs/>
-                <w:color w:val="EA82F1"/>
-                <w:spacing w:val="7"/>
-              </w:rPr>
-              <w:t>线程池</w:t>
-            </w:r>
-          </w:p>
-        </w:tc>
-      </w:tr>
-      <w:tr>
-        <w:tblPrEx>
-          <w:tblBorders>
-            <w:top w:val="single" w:color="auto" w:sz="4" w:space="0"/>
-            <w:left w:val="single" w:color="auto" w:sz="4" w:space="0"/>
-            <w:bottom w:val="single" w:color="auto" w:sz="4" w:space="0"/>
-            <w:right w:val="single" w:color="auto" w:sz="4" w:space="0"/>
-            <w:insideH w:val="single" w:color="auto" w:sz="4" w:space="0"/>
-            <w:insideV w:val="single" w:color="auto" w:sz="4" w:space="0"/>
-          </w:tblBorders>
-          <w:tblCellMar>
-            <w:top w:w="0" w:type="dxa"/>
-            <w:left w:w="108" w:type="dxa"/>
-            <w:bottom w:w="0" w:type="dxa"/>
-            <w:right w:w="108" w:type="dxa"/>
-          </w:tblCellMar>
-        </w:tblPrEx>
-        <w:tc>
-          <w:tcPr>
-            <w:tcW w:w="0" w:type="auto"/>
-            <w:vMerge w:val="restart"/>
-            <w:vAlign w:val="center"/>
-          </w:tcPr>
-          <w:p>
-            <w:pPr>
-              <w:rPr>
-                <w:rFonts w:cs="华文中宋"/>
-                <w:bCs/>
-                <w:color w:val="FFC000"/>
-                <w:spacing w:val="7"/>
-              </w:rPr>
-            </w:pPr>
-            <w:r>
-              <w:rPr>
-                <w:rFonts w:hint="eastAsia" w:cs="华文中宋"/>
-                <w:bCs/>
-                <w:color w:val="ED7D31" w:themeColor="accent2"/>
-                <w:spacing w:val="7"/>
-                <w14:textFill>
-                  <w14:solidFill>
-                    <w14:schemeClr w14:val="accent2"/>
-                  </w14:solidFill>
-                </w14:textFill>
-              </w:rPr>
-              <w:t>实例方法</w:t>
-            </w:r>
-          </w:p>
-        </w:tc>
-        <w:tc>
-          <w:tcPr>
-            <w:tcW w:w="0" w:type="auto"/>
-            <w:vAlign w:val="center"/>
-          </w:tcPr>
-          <w:p>
-            <w:pPr>
-              <w:rPr>
-                <w:rFonts w:cs="华文中宋"/>
-                <w:bCs/>
-                <w:color w:val="FFC000"/>
-                <w:spacing w:val="7"/>
-              </w:rPr>
-            </w:pPr>
-            <w:r>
-              <w:rPr>
-                <w:rFonts w:hint="eastAsia" w:cs="华文中宋"/>
-                <w:bCs/>
-                <w:color w:val="FFC000"/>
-                <w:spacing w:val="7"/>
-              </w:rPr>
-              <w:t>submit(func, *args, **kwargs)</w:t>
-            </w:r>
-          </w:p>
-        </w:tc>
-        <w:tc>
-          <w:tcPr>
-            <w:tcW w:w="0" w:type="auto"/>
-            <w:vAlign w:val="center"/>
-          </w:tcPr>
-          <w:p>
-            <w:pPr>
-              <w:rPr>
-                <w:rFonts w:cs="华文中宋"/>
-                <w:bCs/>
-                <w:color w:val="ED7D31" w:themeColor="accent2"/>
-                <w:spacing w:val="7"/>
-                <w14:textFill>
-                  <w14:solidFill>
-                    <w14:schemeClr w14:val="accent2"/>
-                  </w14:solidFill>
-                </w14:textFill>
-              </w:rPr>
-            </w:pPr>
-            <w:r>
-              <w:rPr>
-                <w:rFonts w:hint="eastAsia" w:cs="华文中宋"/>
-                <w:bCs/>
-                <w:color w:val="ED7D31" w:themeColor="accent2"/>
-                <w:spacing w:val="7"/>
-                <w14:textFill>
-                  <w14:solidFill>
-                    <w14:schemeClr w14:val="accent2"/>
-                  </w14:solidFill>
-                </w14:textFill>
-              </w:rPr>
-              <w:t>生成</w:t>
-            </w:r>
-            <w:r>
-              <w:rPr>
-                <w:rFonts w:hint="eastAsia" w:cs="华文中宋"/>
-                <w:bCs/>
-                <w:color w:val="EA82EB"/>
-                <w:spacing w:val="7"/>
-              </w:rPr>
-              <w:t>后台单线程</w:t>
-            </w:r>
-            <w:r>
-              <w:rPr>
-                <w:rFonts w:hint="eastAsia" w:cs="华文中宋"/>
-                <w:bCs/>
-                <w:color w:val="ED7D31" w:themeColor="accent2"/>
-                <w:spacing w:val="7"/>
-                <w14:textFill>
-                  <w14:solidFill>
-                    <w14:schemeClr w14:val="accent2"/>
-                  </w14:solidFill>
-                </w14:textFill>
-              </w:rPr>
-              <w:t>，返回</w:t>
-            </w:r>
-            <w:r>
-              <w:rPr>
-                <w:rFonts w:hint="eastAsia" w:cs="华文中宋"/>
-                <w:bCs/>
-                <w:color w:val="EA82EB"/>
-                <w:spacing w:val="7"/>
-              </w:rPr>
-              <w:t>Future线程</w:t>
-            </w:r>
-          </w:p>
-        </w:tc>
-      </w:tr>
-      <w:tr>
-        <w:tblPrEx>
-          <w:tblBorders>
-            <w:top w:val="single" w:color="auto" w:sz="4" w:space="0"/>
-            <w:left w:val="single" w:color="auto" w:sz="4" w:space="0"/>
-            <w:bottom w:val="single" w:color="auto" w:sz="4" w:space="0"/>
-            <w:right w:val="single" w:color="auto" w:sz="4" w:space="0"/>
-            <w:insideH w:val="single" w:color="auto" w:sz="4" w:space="0"/>
-            <w:insideV w:val="single" w:color="auto" w:sz="4" w:space="0"/>
-          </w:tblBorders>
-          <w:tblCellMar>
-            <w:top w:w="0" w:type="dxa"/>
-            <w:left w:w="108" w:type="dxa"/>
-            <w:bottom w:w="0" w:type="dxa"/>
-            <w:right w:w="108" w:type="dxa"/>
-          </w:tblCellMar>
-        </w:tblPrEx>
-        <w:tc>
-          <w:tcPr>
-            <w:tcW w:w="0" w:type="auto"/>
-            <w:vMerge w:val="continue"/>
-            <w:vAlign w:val="center"/>
-          </w:tcPr>
-          <w:p>
-            <w:pPr>
-              <w:rPr>
-                <w:rFonts w:cs="华文中宋"/>
-                <w:bCs/>
-                <w:color w:val="ED7D31" w:themeColor="accent2"/>
-                <w:spacing w:val="7"/>
-                <w14:textFill>
-                  <w14:solidFill>
-                    <w14:schemeClr w14:val="accent2"/>
-                  </w14:solidFill>
-                </w14:textFill>
-              </w:rPr>
-            </w:pPr>
-          </w:p>
-        </w:tc>
-        <w:tc>
-          <w:tcPr>
-            <w:tcW w:w="0" w:type="auto"/>
-            <w:vAlign w:val="center"/>
-          </w:tcPr>
-          <w:p>
-            <w:pPr>
-              <w:rPr>
-                <w:rFonts w:cs="华文中宋"/>
-                <w:bCs/>
-                <w:color w:val="FFC000"/>
-                <w:spacing w:val="7"/>
-              </w:rPr>
-            </w:pPr>
-            <w:r>
-              <w:rPr>
-                <w:rFonts w:hint="eastAsia" w:cs="华文中宋"/>
-                <w:bCs/>
-                <w:color w:val="FFC000"/>
-                <w:spacing w:val="7"/>
-              </w:rPr>
-              <w:t>map(func, *iterables, timeout)</w:t>
-            </w:r>
-          </w:p>
-        </w:tc>
-        <w:tc>
-          <w:tcPr>
-            <w:tcW w:w="0" w:type="auto"/>
-            <w:vAlign w:val="center"/>
-          </w:tcPr>
-          <w:p>
-            <w:pPr>
-              <w:rPr>
-                <w:rFonts w:cs="华文中宋"/>
-                <w:bCs/>
-                <w:color w:val="ED7D31" w:themeColor="accent2"/>
-                <w:spacing w:val="7"/>
-                <w14:textFill>
-                  <w14:solidFill>
-                    <w14:schemeClr w14:val="accent2"/>
-                  </w14:solidFill>
-                </w14:textFill>
-              </w:rPr>
-            </w:pPr>
-            <w:r>
-              <w:rPr>
-                <w:rFonts w:hint="eastAsia" w:cs="华文中宋"/>
-                <w:bCs/>
-                <w:color w:val="ED7D31" w:themeColor="accent2"/>
-                <w:spacing w:val="7"/>
-                <w14:textFill>
-                  <w14:solidFill>
-                    <w14:schemeClr w14:val="accent2"/>
-                  </w14:solidFill>
-                </w14:textFill>
-              </w:rPr>
-              <w:t>生成</w:t>
-            </w:r>
-            <w:r>
-              <w:rPr>
-                <w:rFonts w:hint="eastAsia" w:cs="华文中宋"/>
-                <w:bCs/>
-                <w:color w:val="EA82EB"/>
-                <w:spacing w:val="7"/>
-              </w:rPr>
-              <w:t>后台多线程</w:t>
-            </w:r>
-            <w:r>
-              <w:rPr>
-                <w:rFonts w:hint="eastAsia" w:cs="华文中宋"/>
-                <w:bCs/>
-                <w:color w:val="ED7D31" w:themeColor="accent2"/>
-                <w:spacing w:val="7"/>
-                <w14:textFill>
-                  <w14:solidFill>
-                    <w14:schemeClr w14:val="accent2"/>
-                  </w14:solidFill>
-                </w14:textFill>
-              </w:rPr>
-              <w:t>，返回</w:t>
-            </w:r>
-            <w:r>
-              <w:rPr>
-                <w:rFonts w:hint="eastAsia" w:cs="华文中宋"/>
-                <w:bCs/>
-                <w:color w:val="EA82EB"/>
-                <w:spacing w:val="7"/>
-              </w:rPr>
-              <w:t>映射结果迭代器</w:t>
-            </w:r>
-          </w:p>
-        </w:tc>
-      </w:tr>
-      <w:tr>
-        <w:tblPrEx>
-          <w:tblBorders>
-            <w:top w:val="single" w:color="auto" w:sz="4" w:space="0"/>
-            <w:left w:val="single" w:color="auto" w:sz="4" w:space="0"/>
-            <w:bottom w:val="single" w:color="auto" w:sz="4" w:space="0"/>
-            <w:right w:val="single" w:color="auto" w:sz="4" w:space="0"/>
-            <w:insideH w:val="single" w:color="auto" w:sz="4" w:space="0"/>
-            <w:insideV w:val="single" w:color="auto" w:sz="4" w:space="0"/>
-          </w:tblBorders>
-          <w:tblCellMar>
-            <w:top w:w="0" w:type="dxa"/>
-            <w:left w:w="108" w:type="dxa"/>
-            <w:bottom w:w="0" w:type="dxa"/>
-            <w:right w:w="108" w:type="dxa"/>
-          </w:tblCellMar>
-        </w:tblPrEx>
-        <w:tc>
-          <w:tcPr>
-            <w:tcW w:w="0" w:type="auto"/>
-            <w:vAlign w:val="center"/>
-          </w:tcPr>
-          <w:p>
-            <w:pPr>
-              <w:rPr>
-                <w:rFonts w:cs="华文中宋"/>
-                <w:bCs/>
-                <w:color w:val="FFC000"/>
-                <w:spacing w:val="7"/>
-              </w:rPr>
-            </w:pPr>
-            <w:r>
-              <w:rPr>
-                <w:rFonts w:hint="eastAsia" w:cs="华文中宋"/>
-                <w:bCs/>
-                <w:color w:val="ED7D31" w:themeColor="accent2"/>
-                <w:spacing w:val="7"/>
-                <w14:textFill>
-                  <w14:solidFill>
-                    <w14:schemeClr w14:val="accent2"/>
-                  </w14:solidFill>
-                </w14:textFill>
-              </w:rPr>
-              <w:t>Future方法</w:t>
-            </w:r>
-          </w:p>
-        </w:tc>
-        <w:tc>
-          <w:tcPr>
-            <w:tcW w:w="0" w:type="auto"/>
-            <w:vAlign w:val="center"/>
-          </w:tcPr>
-          <w:p>
-            <w:pPr>
-              <w:rPr>
-                <w:rFonts w:cs="华文中宋"/>
-                <w:bCs/>
-                <w:color w:val="FFC000"/>
-                <w:spacing w:val="7"/>
-              </w:rPr>
-            </w:pPr>
-            <w:r>
-              <w:rPr>
-                <w:rFonts w:hint="eastAsia" w:cs="华文中宋"/>
-                <w:bCs/>
-                <w:color w:val="FFC000"/>
-                <w:spacing w:val="7"/>
-              </w:rPr>
-              <w:t>result(timeout)</w:t>
-            </w:r>
-          </w:p>
-        </w:tc>
-        <w:tc>
-          <w:tcPr>
-            <w:tcW w:w="0" w:type="auto"/>
-            <w:vAlign w:val="center"/>
-          </w:tcPr>
-          <w:p>
-            <w:pPr>
-              <w:rPr>
-                <w:rFonts w:cs="华文中宋"/>
-                <w:bCs/>
-                <w:color w:val="ED7D31" w:themeColor="accent2"/>
-                <w:spacing w:val="7"/>
-                <w14:textFill>
-                  <w14:solidFill>
-                    <w14:schemeClr w14:val="accent2"/>
-                  </w14:solidFill>
-                </w14:textFill>
-              </w:rPr>
-            </w:pPr>
-            <w:r>
-              <w:rPr>
-                <w:rFonts w:hint="eastAsia" w:cs="华文中宋"/>
-                <w:bCs/>
-                <w:color w:val="ED7D31" w:themeColor="accent2"/>
-                <w:spacing w:val="7"/>
-                <w14:textFill>
-                  <w14:solidFill>
-                    <w14:schemeClr w14:val="accent2"/>
-                  </w14:solidFill>
-                </w14:textFill>
-              </w:rPr>
-              <w:t>返回</w:t>
-            </w:r>
-            <w:r>
-              <w:rPr>
-                <w:rFonts w:hint="eastAsia" w:cs="华文中宋"/>
-                <w:bCs/>
-                <w:color w:val="EA82EB"/>
-                <w:spacing w:val="7"/>
-              </w:rPr>
-              <w:t>异步进程的结果</w:t>
             </w:r>
           </w:p>
         </w:tc>
@@ -21760,8 +21733,8 @@
           </w14:textFill>
         </w:rPr>
       </w:pPr>
-      <w:bookmarkStart w:id="15" w:name="_Toc14852"/>
-      <w:bookmarkStart w:id="16" w:name="_Toc12616"/>
+      <w:bookmarkStart w:id="15" w:name="_Toc12616"/>
+      <w:bookmarkStart w:id="16" w:name="_Toc14852"/>
       <w:r>
         <w:rPr>
           <w:rFonts w:hint="eastAsia" w:cs="华文中宋"/>
@@ -21829,6 +21802,12 @@
             <w:insideH w:val="single" w:color="auto" w:sz="4" w:space="0"/>
             <w:insideV w:val="single" w:color="auto" w:sz="4" w:space="0"/>
           </w:tblBorders>
+          <w:tblCellMar>
+            <w:top w:w="0" w:type="dxa"/>
+            <w:left w:w="108" w:type="dxa"/>
+            <w:bottom w:w="0" w:type="dxa"/>
+            <w:right w:w="108" w:type="dxa"/>
+          </w:tblCellMar>
         </w:tblPrEx>
         <w:trPr>
           <w:trHeight w:val="282" w:hRule="atLeast"/>
@@ -22108,8 +22087,6 @@
               </w:rPr>
               <w:t>args</w:t>
             </w:r>
-            <w:bookmarkStart w:id="19" w:name="_GoBack"/>
-            <w:bookmarkEnd w:id="19"/>
             <w:r>
               <w:rPr>
                 <w:rFonts w:hint="eastAsia" w:cs="华文中宋"/>

</xml_diff>